<commit_message>
Update ODL materials to take out MSLQ
</commit_message>
<xml_diff>
--- a/docs/Supporting/RM1_ODL_Sem2_Timetable.docx
+++ b/docs/Supporting/RM1_ODL_Sem2_Timetable.docx
@@ -23,7 +23,16 @@
         <w:t>2</w:t>
       </w:r>
       <w:r>
-        <w:t xml:space="preserve"> Course Timetable 2024/2025</w:t>
+        <w:t xml:space="preserve"> Course Timetable 202</w:t>
+      </w:r>
+      <w:r>
+        <w:t>5</w:t>
+      </w:r>
+      <w:r>
+        <w:t>/202</w:t>
+      </w:r>
+      <w:r>
+        <w:t>6</w:t>
       </w:r>
     </w:p>
     <w:p/>
@@ -1138,19 +1147,19 @@
       <w:t xml:space="preserve">Last updated: </w:t>
     </w:r>
     <w:r>
-      <w:t>12</w:t>
+      <w:t>27</w:t>
     </w:r>
     <w:r>
-      <w:t>/0</w:t>
+      <w:t>/</w:t>
     </w:r>
     <w:r>
-      <w:t>9</w:t>
+      <w:t>01</w:t>
     </w:r>
     <w:r>
       <w:t>/202</w:t>
     </w:r>
     <w:r>
-      <w:t>5</w:t>
+      <w:t>6</w:t>
     </w:r>
   </w:p>
   <w:p>

</xml_diff>